<commit_message>
docs: v1.8 report — self pickup in transport
Adds the self-pickup transport option to AMSteel_Quote_Raport_Wersji_1.8.docx:
a new row in the "Kalkulator wyceny" table, an extended 1.8 summary in the
version history table, and updated "Znane problemy" / "Plany" entries now
naming all three v1.8 features awaiting production deployment.

Includes the pre-edit backup copy, per the convention in this folder.

Co-Authored-By: Claude Sonnet 5 <noreply@anthropic.com>
Claude-Session: https://claude.ai/code/session_01CvHaax1NWVokvPR6iNuhko
</commit_message>
<xml_diff>
--- a/Historia wersji oraz md/Historia wersji/AMSteel_Quote_Raport_Wersji_1.8.docx
+++ b/Historia wersji oraz md/Historia wersji/AMSteel_Quote_Raport_Wersji_1.8.docx
@@ -284,7 +284,7 @@
           </w:tcPr>
           <w:p>
             <w:r>
-              <w:t>Dodano opcjonalny komentarz do pozycji z niezerową dopłatą dodatkową w kalkulatorze. Pole komentarza oraz osobny checkbox „Dołącz komentarz do PDF” pojawiają się dopiero po wpisaniu wartości różnej od zera, a treść zapisuje się razem z resztą konfiguracji pozycji (odtwarzana przy edycji, nieusuwana przy chwilowym wyzerowaniu dopłaty). Po zaznaczeniu checkboxa komentarz trafia jako dodatkowy wpis do kolumny „Uwagi” w PDF oferty, we wszystkich miejscach eksportu (kalkulator, Moje oferty, Panel seniora, Panel administratora). Dodano również gatunek jednorazowy — możliwość wyceny gatunku spoza cennika (nazwa + dopłata EUR/t) w obrębie jednej oferty, bez dopisywania go do cennika i bez wpływu na pozostałe oferty.</w:t>
+              <w:t>Dodano opcjonalny komentarz do pozycji z niezerową dopłatą dodatkową w kalkulatorze. Pole komentarza oraz osobny checkbox „Dołącz komentarz do PDF” pojawiają się dopiero po wpisaniu wartości różnej od zera, a treść zapisuje się razem z resztą konfiguracji pozycji (odtwarzana przy edycji, nieusuwana przy chwilowym wyzerowaniu dopłaty). Po zaznaczeniu checkboxa komentarz trafia jako dodatkowy wpis do kolumny „Uwagi” w PDF oferty, we wszystkich miejscach eksportu (kalkulator, Moje oferty, Panel seniora, Panel administratora). Dodano również gatunek jednorazowy — możliwość wyceny gatunku spoza cennika (nazwa + dopłata EUR/t) w obrębie jednej oferty, bez dopisywania go do cennika i bez wpływu na pozostałe oferty. Dodano też opcję odbioru własnego w transporcie — checkbox w panelu „Trasa i transport” ustawia transport na 0 €/t, gdy klient sam odbiera towar spod zakładu.</w:t>
             </w:r>
           </w:p>
         </w:tc>
@@ -925,6 +925,28 @@
           </w:p>
         </w:tc>
       </w:tr>
+      <w:tr>
+        <w:tc>
+          <w:tcPr>
+            <w:tcW w:w="1948" w:type="dxa"/>
+          </w:tcPr>
+          <w:p>
+            <w:r>
+              <w:t>Nowa funkcja</w:t>
+            </w:r>
+          </w:p>
+        </w:tc>
+        <w:tc>
+          <w:tcPr>
+            <w:tcW w:w="6908" w:type="dxa"/>
+          </w:tcPr>
+          <w:p>
+            <w:r>
+              <w:t>Odbiór własny w transporcie — w panelu „Trasa i transport” doszedł checkbox „Odbiór własny”: gdy klient sam odbiera towar spod zakładu, transport ustawia się na 0 €/t, a reszta pól trasy (adres, kilometry, ponadgabaryt, tryb ręczny) zostaje wyszarzona i nieaktywna. Wartość 0 przenosi się też na już dodane pozycje zestawienia — tym samym mechanizmem, który dotąd aktualizował transport po przeliczeniu trasy.</w:t>
+            </w:r>
+          </w:p>
+        </w:tc>
+      </w:tr>
     </w:tbl>
     <w:p>
       <w:pPr>
@@ -1249,7 +1271,7 @@
         <w:pStyle w:val="Listapunktowana"/>
       </w:pPr>
       <w:r>
-        <w:t>Funkcje wersji 1.8 (komentarz do dopłaty dodatkowej oraz gatunek jednorazowy) są gotowe i przetestowane lokalnie, ale nie zostały jeszcze wdrożone na środowisko produkcyjne; nie wymagają migracji bazy danych (dane trafiają do istniejącego pola JSONB „offer_data”).</w:t>
+        <w:t>Funkcje wersji 1.8 (komentarz do dopłaty dodatkowej, gatunek jednorazowy oraz odbiór własny w transporcie) są gotowe i przetestowane lokalnie, ale nie zostały jeszcze wdrożone na środowisko produkcyjne; nie wymagają migracji bazy danych (dane trafiają do istniejącego pola JSONB „offer_data”).</w:t>
       </w:r>
     </w:p>
     <w:p>
@@ -1270,7 +1292,7 @@
         <w:pStyle w:val="Listapunktowana"/>
       </w:pPr>
       <w:r>
-        <w:t>Wdrożenie wersji 1.8 (komentarz do dopłaty dodatkowej, gatunek jednorazowy) na środowisko produkcyjne</w:t>
+        <w:t>Wdrożenie wersji 1.8 (komentarz do dopłaty dodatkowej, gatunek jednorazowy, odbiór własny w transporcie) na środowisko produkcyjne</w:t>
       </w:r>
     </w:p>
     <w:p>

</xml_diff>

<commit_message>
docs: v1.8 report — quarterly PGL schedule
Adds the feature to the Kalkulator wyceny section and the 1.8 version-history
summary. Also corrects the known-issues note that claimed v1.8 needs no database
migration: that holds for the first three features, but the quarterly schedule
requires 021_create_pgl_quarterly_prices.sql to run before the file swap.

Co-Authored-By: Claude Opus 5 <noreply@anthropic.com>
Claude-Session: https://claude.ai/code/session_01HaAScu6u1zZMZM1NS6xm5u
</commit_message>
<xml_diff>
--- a/Historia wersji oraz md/Historia wersji/AMSteel_Quote_Raport_Wersji_1.8.docx
+++ b/Historia wersji oraz md/Historia wersji/AMSteel_Quote_Raport_Wersji_1.8.docx
@@ -284,7 +284,7 @@
           </w:tcPr>
           <w:p>
             <w:r>
-              <w:t>Dodano opcjonalny komentarz do pozycji z niezerową dopłatą dodatkową w kalkulatorze. Pole komentarza oraz osobny checkbox „Dołącz komentarz do PDF” pojawiają się dopiero po wpisaniu wartości różnej od zera, a treść zapisuje się razem z resztą konfiguracji pozycji (odtwarzana przy edycji, nieusuwana przy chwilowym wyzerowaniu dopłaty). Po zaznaczeniu checkboxa komentarz trafia jako dodatkowy wpis do kolumny „Uwagi” w PDF oferty, we wszystkich miejscach eksportu (kalkulator, Moje oferty, Panel seniora, Panel administratora). Dodano również gatunek jednorazowy — możliwość wyceny gatunku spoza cennika (nazwa + dopłata EUR/t) w obrębie jednej oferty, bez dopisywania go do cennika i bez wpływu na pozostałe oferty. Dodano też opcję odbioru własnego w transporcie — checkbox w panelu „Trasa i transport” ustawia transport na 0 €/t, gdy klient sam odbiera towar spod zakładu.</w:t>
+              <w:t>Dodano opcjonalny komentarz do pozycji z niezerową dopłatą dodatkową w kalkulatorze. Pole komentarza oraz osobny checkbox „Dołącz komentarz do PDF” pojawiają się dopiero po wpisaniu wartości różnej od zera, a treść zapisuje się razem z resztą konfiguracji pozycji (odtwarzana przy edycji, nieusuwana przy chwilowym wyzerowaniu dopłaty). Po zaznaczeniu checkboxa komentarz trafia jako dodatkowy wpis do kolumny „Uwagi” w PDF oferty, we wszystkich miejscach eksportu (kalkulator, Moje oferty, Panel seniora, Panel administratora). Dodano również gatunek jednorazowy — możliwość wyceny gatunku spoza cennika (nazwa + dopłata EUR/t) w obrębie jednej oferty, bez dopisywania go do cennika i bez wpływu na pozostałe oferty. Dodano też opcję odbioru własnego w transporcie — checkbox w panelu „Trasa i transport” ustawia transport na 0 €/t, gdy klient sam odbiera towar spod zakładu. Dodano też harmonogram kwartalny PGL bazowego: administrator planuje ceny na Q1–Q4 wybranego roku osobno dla każdego typu stali, a kalkulator przełącza się na cenę danego kwartału automatycznie z chwilą jego rozpoczęcia. Tabela w panelu administratora pokazuje obok siebie cenę bieżącego miesiąca i wszystkie cztery kwartały. Funkcja wymaga migracji bazy danych (021_create_pgl_quarterly_prices.sql).</w:t>
             </w:r>
           </w:p>
         </w:tc>
@@ -947,6 +947,28 @@
           </w:p>
         </w:tc>
       </w:tr>
+      <w:tr>
+        <w:tc>
+          <w:tcPr>
+            <w:tcW w:w="1948" w:type="dxa"/>
+          </w:tcPr>
+          <w:p>
+            <w:r>
+              <w:t>Nowa funkcja</w:t>
+            </w:r>
+          </w:p>
+        </w:tc>
+        <w:tc>
+          <w:tcPr>
+            <w:tcW w:w="6908" w:type="dxa"/>
+          </w:tcPr>
+          <w:p>
+            <w:r>
+              <w:t>Harmonogram kwartalny PGL — w panelu administratora sekcja „Konfiguracja” zyskała jedną tabelę PGL bazowego: wiersz na typ stali (HRS, CR, HDG, PICKLED, TEARDROP, ZM), kolumna bieżącego miesiąca oraz kolumny Q1–Q4 wybranego roku (przełącznik roku obok nagłówka). Administrator może wpisać cenę na przyszły kwartał z wyprzedzeniem — kalkulator zaczyna jej używać sam, z chwilą rozpoczęcia tego kwartału, bez żadnej dodatkowej akcji. Kolumna bieżącego miesiąca pokazuje cenę obowiązującą w danej chwili: gdy pochodzi z zaplanowanego kwartału, jest tylko do odczytu i oznaczona numerem tego kwartału (edycja odbywa się w jego kolumnie), a gdy dla trwającego kwartału nic nie zaplanowano — pozostaje zwykłym polem z dotychczasową wartością ręczną. Aktywny kwartał jest w tabeli wyróżniony. Zaplanowane ceny wpływają wyłącznie na wartość startową NOWEJ kalkulacji oraz na próg wymagający zatwierdzenia oferty; oferty zapisane, oczekujące na akceptację i wysłane zachowują PGL z dnia wyceny. Funkcja wymaga migracji bazy danych (021_create_pgl_quarterly_prices.sql).</w:t>
+            </w:r>
+          </w:p>
+        </w:tc>
+      </w:tr>
     </w:tbl>
     <w:p>
       <w:pPr>
@@ -1271,7 +1293,7 @@
         <w:pStyle w:val="Listapunktowana"/>
       </w:pPr>
       <w:r>
-        <w:t>Funkcje wersji 1.8 (komentarz do dopłaty dodatkowej, gatunek jednorazowy oraz odbiór własny w transporcie) są gotowe i przetestowane lokalnie, ale nie zostały jeszcze wdrożone na środowisko produkcyjne; nie wymagają migracji bazy danych (dane trafiają do istniejącego pola JSONB „offer_data”).</w:t>
+        <w:t>Funkcje wersji 1.8 (komentarz do dopłaty dodatkowej, gatunek jednorazowy, odbiór własny w transporcie oraz harmonogram kwartalny PGL) są gotowe i przetestowane lokalnie, ale nie zostały jeszcze wdrożone na środowisko produkcyjne; trzy pierwsze nie wymagają migracji bazy danych (dane trafiają do istniejącego pola JSONB „offer_data”), natomiast harmonogram kwartalny PGL wymaga uruchomienia migracji 021_create_pgl_quarterly_prices.sql przed podmianą plików aplikacji.</w:t>
       </w:r>
     </w:p>
     <w:p>
@@ -1292,7 +1314,7 @@
         <w:pStyle w:val="Listapunktowana"/>
       </w:pPr>
       <w:r>
-        <w:t>Wdrożenie wersji 1.8 (komentarz do dopłaty dodatkowej, gatunek jednorazowy, odbiór własny w transporcie) na środowisko produkcyjne</w:t>
+        <w:t>Wdrożenie wersji 1.8 (komentarz do dopłaty dodatkowej, gatunek jednorazowy, odbiór własny w transporcie, harmonogram kwartalny PGL) na środowisko produkcyjne — wraz z migracją 021_create_pgl_quarterly_prices.sql</w:t>
       </w:r>
     </w:p>
     <w:p>

</xml_diff>

<commit_message>
docs: v1.8 report — PGL base fix and repository documentation
Fills in the previously empty "Zmiany ogólne / systemowe" section with the README
rewrite, the refreshed calculator screenshots, the GitHub About description (still
advertising 1.5) and the version badge bump to v1.8.

Adds a Poprawka row under Kalkulator wyceny for the settings save that overwrote the
manual base PGL with the quarterly price, and extends the 1.8 version-history summary
with both.

Co-Authored-By: Claude Opus 5 <noreply@anthropic.com>
Claude-Session: https://claude.ai/code/session_01HaAScu6u1zZMZM1NS6xm5u
</commit_message>
<xml_diff>
--- a/Historia wersji oraz md/Historia wersji/AMSteel_Quote_Raport_Wersji_1.8.docx
+++ b/Historia wersji oraz md/Historia wersji/AMSteel_Quote_Raport_Wersji_1.8.docx
@@ -284,7 +284,7 @@
           </w:tcPr>
           <w:p>
             <w:r>
-              <w:t>Dodano opcjonalny komentarz do pozycji z niezerową dopłatą dodatkową w kalkulatorze. Pole komentarza oraz osobny checkbox „Dołącz komentarz do PDF” pojawiają się dopiero po wpisaniu wartości różnej od zera, a treść zapisuje się razem z resztą konfiguracji pozycji (odtwarzana przy edycji, nieusuwana przy chwilowym wyzerowaniu dopłaty). Po zaznaczeniu checkboxa komentarz trafia jako dodatkowy wpis do kolumny „Uwagi” w PDF oferty, we wszystkich miejscach eksportu (kalkulator, Moje oferty, Panel seniora, Panel administratora). Dodano również gatunek jednorazowy — możliwość wyceny gatunku spoza cennika (nazwa + dopłata EUR/t) w obrębie jednej oferty, bez dopisywania go do cennika i bez wpływu na pozostałe oferty. Dodano też opcję odbioru własnego w transporcie — checkbox w panelu „Trasa i transport” ustawia transport na 0 €/t, gdy klient sam odbiera towar spod zakładu. Dodano też harmonogram kwartalny PGL bazowego: administrator planuje ceny na Q1–Q4 wybranego roku osobno dla każdego typu stali, a kalkulator przełącza się na cenę danego kwartału automatycznie z chwilą jego rozpoczęcia. Tabela w panelu administratora pokazuje obok siebie cenę bieżącego miesiąca i wszystkie cztery kwartały. Funkcja wymaga migracji bazy danych (021_create_pgl_quarterly_prices.sql).</w:t>
+              <w:t>Dodano opcjonalny komentarz do pozycji z niezerową dopłatą dodatkową w kalkulatorze. Pole komentarza oraz osobny checkbox „Dołącz komentarz do PDF” pojawiają się dopiero po wpisaniu wartości różnej od zera, a treść zapisuje się razem z resztą konfiguracji pozycji (odtwarzana przy edycji, nieusuwana przy chwilowym wyzerowaniu dopłaty). Po zaznaczeniu checkboxa komentarz trafia jako dodatkowy wpis do kolumny „Uwagi” w PDF oferty, we wszystkich miejscach eksportu (kalkulator, Moje oferty, Panel seniora, Panel administratora). Dodano również gatunek jednorazowy — możliwość wyceny gatunku spoza cennika (nazwa + dopłata EUR/t) w obrębie jednej oferty, bez dopisywania go do cennika i bez wpływu na pozostałe oferty. Dodano też opcję odbioru własnego w transporcie — checkbox w panelu „Trasa i transport” ustawia transport na 0 €/t, gdy klient sam odbiera towar spod zakładu. Dodano też harmonogram kwartalny PGL bazowego: administrator planuje ceny na Q1–Q4 wybranego roku osobno dla każdego typu stali, a kalkulator przełącza się na cenę danego kwartału automatycznie z chwilą jego rozpoczęcia. Tabela w panelu administratora pokazuje obok siebie cenę bieżącego miesiąca i wszystkie cztery kwartały. Funkcja wymaga migracji bazy danych (021_create_pgl_quarterly_prices.sql). Poprawiono też zapis ustawień, który przy aktywnej cenie kwartalnej nadpisywał nią ręczną cenę bazową PGL, oraz zaktualizowano dokumentację repozytorium (README, opis „About” na GitHubie, zrzuty ekranu kalkulatora) i numer wersji w nagłówku aplikacji do v1.8.</w:t>
             </w:r>
           </w:p>
         </w:tc>
@@ -806,7 +806,29 @@
           </w:tcPr>
           <w:p>
             <w:r>
-              <w:t>(w przygotowaniu)</w:t>
+              <w:t>Dokumentacja repozytorium — README opisywał stan sprzed kilku wersji: brakowało transportu liczonego z trasy, zespołów seniora, metryk handlowców i całej wersji 1.8, a lista migracji bazy urywała się na 018. Opis funkcji został przepisany i pogrupowany w sekcje, listę migracji zastąpiono pętlą po katalogu migrations (nie zdezaktualizuje się przy kolejnej migracji), doszła tabela zmiennych środowiskowych wraz z kluczem do wyznaczania tras oraz opis uruchomienia środowiska lokalnego jednym skryptem. Odświeżono także trzy zrzuty ekranu kalkulatora — poprzednie pochodziły z lipca i pokazywały wersję 1.0 z trzema typami stali zamiast obecnych sześciu. Zaktualizowano również opis repozytorium na GitHubie (sekcja „About”), który nadal mówił o wersji 1.5.</w:t>
+            </w:r>
+          </w:p>
+        </w:tc>
+      </w:tr>
+      <w:tr>
+        <w:tc>
+          <w:tcPr>
+            <w:tcW w:w="1948" w:type="dxa"/>
+          </w:tcPr>
+          <w:p>
+            <w:r>
+              <w:t>Zmiana</w:t>
+            </w:r>
+          </w:p>
+        </w:tc>
+        <w:tc>
+          <w:tcPr>
+            <w:tcW w:w="6908" w:type="dxa"/>
+          </w:tcPr>
+          <w:p>
+            <w:r>
+              <w:t>Numer wersji w nagłówku aplikacji podniesiony do v1.8 we wszystkich czterech językach. Zgodnie z przyjętą zasadą repozytorium wyprzedza produkcję o jedną wersję: na środowisku produkcyjnym działa 1.7, w repozytorium trwają prace nad 1.8.</w:t>
             </w:r>
           </w:p>
         </w:tc>
@@ -965,6 +987,28 @@
           <w:p>
             <w:r>
               <w:t>Harmonogram kwartalny PGL — w panelu administratora sekcja „Konfiguracja” zyskała jedną tabelę PGL bazowego: wiersz na typ stali (HRS, CR, HDG, PICKLED, TEARDROP, ZM), kolumna bieżącego miesiąca oraz kolumny Q1–Q4 wybranego roku (przełącznik roku obok nagłówka). Administrator może wpisać cenę na przyszły kwartał z wyprzedzeniem — kalkulator zaczyna jej używać sam, z chwilą rozpoczęcia tego kwartału, bez żadnej dodatkowej akcji. Kolumna bieżącego miesiąca pokazuje cenę obowiązującą w danej chwili: gdy pochodzi z zaplanowanego kwartału, jest tylko do odczytu i oznaczona numerem tego kwartału (edycja odbywa się w jego kolumnie), a gdy dla trwającego kwartału nic nie zaplanowano — pozostaje zwykłym polem z dotychczasową wartością ręczną. Aktywny kwartał jest w tabeli wyróżniony. Zaplanowane ceny wpływają wyłącznie na wartość startową NOWEJ kalkulacji oraz na próg wymagający zatwierdzenia oferty; oferty zapisane, oczekujące na akceptację i wysłane zachowują PGL z dnia wyceny. Funkcja wymaga migracji bazy danych (021_create_pgl_quarterly_prices.sql).</w:t>
+            </w:r>
+          </w:p>
+        </w:tc>
+      </w:tr>
+      <w:tr>
+        <w:tc>
+          <w:tcPr>
+            <w:tcW w:w="1948" w:type="dxa"/>
+          </w:tcPr>
+          <w:p>
+            <w:r>
+              <w:t>Poprawka</w:t>
+            </w:r>
+          </w:p>
+        </w:tc>
+        <w:tc>
+          <w:tcPr>
+            <w:tcW w:w="6908" w:type="dxa"/>
+          </w:tcPr>
+          <w:p>
+            <w:r>
+              <w:t>Zapis ustawień nie nadpisuje już ręcznej ceny bazowej PGL ceną kwartalną. Gdy dla danego typu stali obowiązywała cena zaplanowana na bieżący kwartał, formularz ustawień trzymał właśnie tę wartość i przy zapisie karty odsyłał ją do kolumny z ceną ręczną — czyli do wartości, z której kalkulator korzysta po zakończeniu kwartału, gdy kolejny nie ma jeszcze zaplanowanej ceny. Działo się to przy każdym zapisie tej karty, również wtedy, gdy administrator zmieniał wyłącznie kurs waluty. Po poprawce zapis pomija ceny bazowe tych typów, dla których bieżący kwartał ma zaplanowaną cenę — ich pola i tak są w tabeli tylko do odczytu. Błąd wykryty i naprawiony przed wdrożeniem wersji 1.8.</w:t>
             </w:r>
           </w:p>
         </w:tc>

</xml_diff>

<commit_message>
feat: collapsible calculation panel + v1.8 report update
Calculation panel (steel type selector, ARKUSZ/KRAG mode, input
parameters, sheet weight/warnings, and the pricing grid) now collapses
and expands with a header toggle, matching the existing Client Info
panel. Expanded by default; Zestawienie stays always visible below it.

Added calcPanel.title/subtitle translations (PL/EN/CS/DE) and updated
the v1.8 version report to document the new feature.

Co-Authored-By: Claude Sonnet 5 <noreply@anthropic.com>
Claude-Session: https://claude.ai/code/session_013gbQyV1axR3dxiPqUukkvq
</commit_message>
<xml_diff>
--- a/Historia wersji oraz md/Historia wersji/AMSteel_Quote_Raport_Wersji_1.8.docx
+++ b/Historia wersji oraz md/Historia wersji/AMSteel_Quote_Raport_Wersji_1.8.docx
@@ -284,7 +284,7 @@
           </w:tcPr>
           <w:p>
             <w:r>
-              <w:t>Dodano opcjonalny komentarz do pozycji z niezerową dopłatą dodatkową w kalkulatorze. Pole komentarza oraz osobny checkbox „Dołącz komentarz do PDF” pojawiają się dopiero po wpisaniu wartości różnej od zera, a treść zapisuje się razem z resztą konfiguracji pozycji (odtwarzana przy edycji, nieusuwana przy chwilowym wyzerowaniu dopłaty). Po zaznaczeniu checkboxa komentarz trafia jako dodatkowy wpis do kolumny „Uwagi” w PDF oferty, we wszystkich miejscach eksportu (kalkulator, Moje oferty, Panel seniora, Panel administratora). Dodano również gatunek jednorazowy — możliwość wyceny gatunku spoza cennika (nazwa + dopłata EUR/t) w obrębie jednej oferty, bez dopisywania go do cennika i bez wpływu na pozostałe oferty. Dodano też opcję odbioru własnego w transporcie — checkbox w panelu „Trasa i transport” ustawia transport na 0 €/t, gdy klient sam odbiera towar spod zakładu. Dodano też harmonogram kwartalny PGL bazowego: administrator planuje ceny na Q1–Q4 wybranego roku osobno dla każdego typu stali, a kalkulator przełącza się na cenę danego kwartału automatycznie z chwilą jego rozpoczęcia. Tabela w panelu administratora pokazuje obok siebie cenę bieżącego miesiąca i wszystkie cztery kwartały. Funkcja wymaga migracji bazy danych (021_create_pgl_quarterly_prices.sql). Poprawiono też zapis ustawień, który przy aktywnej cenie kwartalnej nadpisywał nią ręczną cenę bazową PGL, oraz zaktualizowano dokumentację repozytorium (README, opis „About” na GitHubie, zrzuty ekranu kalkulatora) i numer wersji w nagłówku aplikacji do v1.8.</w:t>
+              <w:t>Dodano opcjonalny komentarz do pozycji z niezerową dopłatą dodatkową w kalkulatorze. Pole komentarza oraz osobny checkbox „Dołącz komentarz do PDF” pojawiają się dopiero po wpisaniu wartości różnej od zera, a treść zapisuje się razem z resztą konfiguracji pozycji (odtwarzana przy edycji, nieusuwana przy chwilowym wyzerowaniu dopłaty). Po zaznaczeniu checkboxa komentarz trafia jako dodatkowy wpis do kolumny „Uwagi” w PDF oferty, we wszystkich miejscach eksportu (kalkulator, Moje oferty, Panel seniora, Panel administratora). Dodano również gatunek jednorazowy — możliwość wyceny gatunku spoza cennika (nazwa + dopłata EUR/t) w obrębie jednej oferty, bez dopisywania go do cennika i bez wpływu na pozostałe oferty. Dodano też opcję odbioru własnego w transporcie — checkbox w panelu „Trasa i transport” ustawia transport na 0 €/t, gdy klient sam odbiera towar spod zakładu. Dodano też harmonogram kwartalny PGL bazowego: administrator planuje ceny na Q1–Q4 wybranego roku osobno dla każdego typu stali, a kalkulator przełącza się na cenę danego kwartału automatycznie z chwilą jego rozpoczęcia. Tabela w panelu administratora pokazuje obok siebie cenę bieżącego miesiąca i wszystkie cztery kwartały. Funkcja wymaga migracji bazy danych (021_create_pgl_quarterly_prices.sql). Poprawiono też zapis ustawień, który przy aktywnej cenie kwartalnej nadpisywał nią ręczną cenę bazową PGL, oraz zaktualizowano dokumentację repozytorium (README, opis „About” na GitHubie, zrzuty ekranu kalkulatora) i numer wersji w nagłówku aplikacji do v1.8. Cały panel kalkulacji zyskał też zwijanie/rozwijanie jednym kliknięciem, analogicznie do panelu Danych Klienta.</w:t>
             </w:r>
           </w:p>
         </w:tc>
@@ -998,6 +998,28 @@
           </w:tcPr>
           <w:p>
             <w:r>
+              <w:t>Nowa funkcja</w:t>
+            </w:r>
+          </w:p>
+        </w:tc>
+        <w:tc>
+          <w:tcPr>
+            <w:tcW w:w="6908" w:type="dxa"/>
+          </w:tcPr>
+          <w:p>
+            <w:r>
+              <w:t>Panel kalkulacji zwijany – cały blok liczenia jednej pozycji (wybór typu blachy, przełącznik ARKUSZ/KRĄG, parametry wejściowe, waga arkusza/ostrzeżenia oraz siatka wynikowa z dopłatami huty, dopłatami SSC i marżą) zyskał nagłówek z możliwością zwinięcia i rozwinięcia, dokładnie tak samo jak panel Danych Klienta powyżej niego. Domyślnie rozwinięty przy wejściu na kalkulator; zestawienie pozycji oferty zostaje osobnym, zawsze widocznym panelem poniżej, niezależnie od stanu panelu kalkulacji – zwinięcie ułatwia szybkie przewijanie do zestawienia przy dłuższych ofertach.</w:t>
+            </w:r>
+          </w:p>
+        </w:tc>
+      </w:tr>
+      <w:tr>
+        <w:tc>
+          <w:tcPr>
+            <w:tcW w:w="1948" w:type="dxa"/>
+          </w:tcPr>
+          <w:p>
+            <w:r>
               <w:t>Poprawka</w:t>
             </w:r>
           </w:p>

</xml_diff>

<commit_message>
fix: make PGL/margin below-threshold warnings visible with red border
Calculator: swap the faint 10px yellow warning text for a bold, red
bordered/tinted box on both the PGL-below-base and margin-below-minimum
messages — sellers reported the caution-icon yellow text was easy to miss.

docs: log the fix in the v1.8 version report.

Co-Authored-By: Claude Sonnet 5 <noreply@anthropic.com>
Claude-Session: https://claude.ai/code/session_01PvKxBQanX3Bkf891rFmc5a
</commit_message>
<xml_diff>
--- a/Historia wersji oraz md/Historia wersji/AMSteel_Quote_Raport_Wersji_1.8.docx
+++ b/Historia wersji oraz md/Historia wersji/AMSteel_Quote_Raport_Wersji_1.8.docx
@@ -117,8 +117,6 @@
             <w:r>
               <w:t>11.09.2026 - 11.09.2026</w:t>
             </w:r>
-            <w:proofErr w:type="gramStart"/>
-            <w:proofErr w:type="gramEnd"/>
           </w:p>
         </w:tc>
       </w:tr>
@@ -284,7 +282,7 @@
           </w:tcPr>
           <w:p>
             <w:r>
-              <w:t>Dodano opcjonalny komentarz do pozycji z niezerową dopłatą dodatkową w kalkulatorze. Pole komentarza oraz osobny checkbox „Dołącz komentarz do PDF” pojawiają się dopiero po wpisaniu wartości różnej od zera, a treść zapisuje się razem z resztą konfiguracji pozycji (odtwarzana przy edycji, nieusuwana przy chwilowym wyzerowaniu dopłaty). Po zaznaczeniu checkboxa komentarz trafia jako dodatkowy wpis do kolumny „Uwagi” w PDF oferty, we wszystkich miejscach eksportu (kalkulator, Moje oferty, Panel seniora, Panel administratora). Dodano również gatunek jednorazowy — możliwość wyceny gatunku spoza cennika (nazwa + dopłata EUR/t) w obrębie jednej oferty, bez dopisywania go do cennika i bez wpływu na pozostałe oferty. Dodano też opcję odbioru własnego w transporcie — checkbox w panelu „Trasa i transport” ustawia transport na 0 €/t, gdy klient sam odbiera towar spod zakładu. Dodano też harmonogram kwartalny PGL bazowego: administrator planuje ceny na Q1–Q4 wybranego roku osobno dla każdego typu stali, a kalkulator przełącza się na cenę danego kwartału automatycznie z chwilą jego rozpoczęcia. Tabela w panelu administratora pokazuje obok siebie cenę bieżącego miesiąca i wszystkie cztery kwartały. Funkcja wymaga migracji bazy danych (021_create_pgl_quarterly_prices.sql). Poprawiono też zapis ustawień, który przy aktywnej cenie kwartalnej nadpisywał nią ręczną cenę bazową PGL, oraz zaktualizowano dokumentację repozytorium (README, opis „About” na GitHubie, zrzuty ekranu kalkulatora) i numer wersji w nagłówku aplikacji do v1.8. Cały panel kalkulacji zyskał też zwijanie/rozwijanie jednym kliknięciem, analogicznie do panelu Danych Klienta.</w:t>
+              <w:t>Dodano opcjonalny komentarz do pozycji z niezerową dopłatą dodatkową w kalkulatorze. Pole komentarza oraz osobny checkbox „Dołącz komentarz do PDF” pojawiają się dopiero po wpisaniu wartości różnej od zera, a treść zapisuje się razem z resztą konfiguracji pozycji (odtwarzana przy edycji, nieusuwana przy chwilowym wyzerowaniu dopłaty). Po zaznaczeniu checkboxa komentarz trafia jako dodatkowy wpis do kolumny „Uwagi” w PDF oferty, we wszystkich miejscach eksportu (kalkulator, Moje oferty, Panel seniora, Panel administratora). Dodano również gatunek jednorazowy — możliwość wyceny gatunku spoza cennika (nazwa + dopłata EUR/t) w obrębie jednej oferty, bez dopisywania go do cennika i bez wpływu na pozostałe oferty. Dodano też opcję odbioru własnego w transporcie — checkbox w panelu „Trasa i transport” ustawia transport na 0 €/t, gdy klient sam odbiera towar spod zakładu. Dodano też harmonogram kwartalny PGL bazowego: administrator planuje ceny na Q1–Q4 wybranego roku osobno dla każdego typu stali, a kalkulator przełącza się na cenę danego kwartału automatycznie z chwilą jego rozpoczęcia. Tabela w panelu administratora pokazuje obok siebie cenę bieżącego miesiąca i wszystkie cztery kwartały. Funkcja wymaga migracji bazy danych (021_create_pgl_quarterly_prices.sql). Poprawiono też zapis ustawień, który przy aktywnej cenie kwartalnej nadpisywał nią ręczną cenę bazową PGL, oraz zaktualizowano dokumentację repozytorium (README, opis „About” na GitHubie, zrzuty ekranu kalkulatora) i numer wersji w nagłówku aplikacji do v1.8. Cały panel kalkulacji zyskał też zwijanie/rozwijanie jednym kliknięciem, analogicznie do panelu Danych Klienta. Ostrzeżenia o PGL poniżej bazy i marży poniżej minimum stały się też wyraźnie widoczne - zamiast drobnego żółtego tekstu pokazują się teraz jako czerwono obramowany, pogrubiony komunikat.</w:t>
             </w:r>
           </w:p>
         </w:tc>
@@ -306,10 +304,7 @@
           </w:tcPr>
           <w:p>
             <w:r>
-              <w:t>01.09.2026</w:t>
-            </w:r>
-            <w:r>
-              <w:t>, 10.09.2026</w:t>
+              <w:t>01.09.2026, 10.09.2026</w:t>
             </w:r>
           </w:p>
         </w:tc>
@@ -372,17 +367,7 @@
           </w:tcPr>
           <w:p>
             <w:r>
-              <w:t>Uzupełniono tabelę gatunków PICKLED (HRS Trawiona) o brakujący zakres SAPH 440 -&gt; DD12 wraz z dodatkowymi gatunkami (K367-DD14+B, FE 600 DP, S300EK, P265GH, P275SL, P355NL2, SA516G60-LOWSI, S240 D), na podstawie danych przekazanych przez klienta. Poprawiono czytelność etykiet wersjonowania na liście ofert (numer oferty offer_id/offer_</w:t>
-            </w:r>
-            <w:proofErr w:type="gramStart"/>
-            <w:r>
-              <w:t>id.N</w:t>
-            </w:r>
-            <w:proofErr w:type="gramEnd"/>
-            <w:r>
-              <w:t xml:space="preserve"> zamieniony miejscami z nazwą oferty jako główny nagłówek wiersza, wyraźniejsza etykieta „poprzednia wersja”). Przycisk „Aktualizuj pozycję” w kalkulatorze zmienia teraz kolor na niebieski podczas edycji istniejącej pozycji, aby odróżnić go od żółtego przycisku dodawania nowej pozycji. Kliknięcie pozycji na liście zestawienia (wiersz lub ołówek) przewija teraz widok automatycznie do góry kalkulatora. Cena bazowa PGL jest od teraz zawsze w EUR (€/t), niezależnie od waluty oferty. Podczas edycji zapisanej oferty w kalkulatorze pojawia się teraz wyraźny baner „Teraz edytujesz ofertę: offer_id”, tak by nie pomylić jej z tworzeniem nowej wyceny; baner pokazuje właściwy numer wersji (np. offer_27.1), nie surowe wewnętrzne ID wiersza w bazie. Tryb wysokiego kontrastu doczekał się osobnych wariantów jasnego i ciemnego (wcześniej był to jeden, stały motyw ignorujący przełącznik jasny/ciemny) - przełączanie między jasnym a ciemnym motywem działa teraz poprawnie również przy włączonym wysokim kontraście, a wyłączenie wysokiego kontrastu przywraca wcześniej wybrany motyw jasny lub ciemny. Poprawiono też kilka miejsc w interfejsie (pasek „Suma Huta”, </w:t>
-            </w:r>
-            <w:r>
+              <w:t xml:space="preserve">Uzupełniono tabelę gatunków PICKLED (HRS Trawiona) o brakujący zakres SAPH 440 -&gt; DD12 wraz z dodatkowymi gatunkami (K367-DD14+B, FE 600 DP, S300EK, P265GH, P275SL, P355NL2, SA516G60-LOWSI, S240 D), na podstawie danych przekazanych przez klienta. Poprawiono czytelność etykiet wersjonowania na liście ofert (numer oferty offer_id/offer_id.N zamieniony miejscami z nazwą oferty jako główny nagłówek wiersza, wyraźniejsza etykieta „poprzednia wersja”). Przycisk „Aktualizuj pozycję” w kalkulatorze zmienia teraz kolor na niebieski podczas edycji istniejącej pozycji, aby odróżnić go od żółtego przycisku dodawania nowej pozycji. Kliknięcie pozycji na liście zestawienia (wiersz lub ołówek) przewija teraz widok automatycznie do góry kalkulatora. Cena bazowa PGL jest od teraz zawsze w EUR (€/t), niezależnie od waluty oferty. Podczas edycji zapisanej oferty w kalkulatorze pojawia się teraz wyraźny baner „Teraz edytujesz ofertę: offer_id”, tak by nie pomylić jej z tworzeniem nowej wyceny; baner pokazuje właściwy numer wersji (np. offer_27.1), nie surowe wewnętrzne ID wiersza w bazie. Tryb wysokiego kontrastu doczekał się osobnych wariantów jasnego i ciemnego (wcześniej był to jeden, stały motyw ignorujący przełącznik jasny/ciemny) - przełączanie między jasnym a ciemnym motywem działa teraz poprawnie również przy włączonym wysokim kontraście, a wyłączenie wysokiego kontrastu przywraca wcześniej wybrany motyw jasny lub ciemny. Poprawiono też kilka miejsc w interfejsie (pasek „Suma Huta”, </w:t>
               <w:lastRenderedPageBreak/>
               <w:t>przyciski przełączające, podpowiedzi gatunków, komunikaty ostrzegawcze), w których kolory tła i tekstu były zapisane na sztywno pod jasny wysoki kontrast i stawały się nieczytelne w wariancie ciemnym. Panel administratora zyskał filtrowanie i sortowanie historii zmian cen bazowych PGL (po typie stali, zakresie dat i dowolnej kolumnie tabeli) wraz z przyciskiem czyszczącym filtry; eksport do Excela odzwierciedla teraz aktualnie wybrany widok, a nie zawsze całą historię. Generowanie oferty PDF respektuje teraz język interfejsu wybrany przez handlowca (PL/EN/CS/DE) - wcześniej cały szablon PDF (nagłówki tabeli, etykiety danych klienta, uwagi prawne w stopce, podpisy) był na sztywno po polsku, niezależnie od języka ustawionego w aplikacji. Na liście „Moje oferty” naprawiono kliknięcie w rozwiniętej historii wersji ofert, które błędnie otwierało do edycji zawsze najnowszą wersję zamiast tej faktycznie klikniętej. W tej samej wersji dodano panel „Analiza” dla wszystkich ról (tonaż zaoferowany, wygrany i przegrany, wskaźnik skuteczności, rozbicie w czasie oraz według typu stali i klienta, tabela ofert z eksportem; zakres danych ustalany po stronie serwera - junior i senior widzą własne oferty, administrator całą firmę) wraz z nową osią „decyzja klienta” na ofercie wysłanej („wygrana” / „przegrana” / „oczekująca”, migracja 018), niezależną od statusu obiegu oferty.</w:t>
             </w:r>
@@ -428,20 +413,8 @@
           <w:p>
             <w:r>
               <w:t xml:space="preserve">Naprawiono brak synchronizacji kontaktu głównego wpisywanego w panelu „Klienci” z tabelą osób kontaktowych - dane osoby zapisane przy edycji firmy nie pojawiały się w zakładce „Kontakty”. Panel „Klienci” </w:t>
-            </w:r>
-            <w:r>
               <w:lastRenderedPageBreak/>
-              <w:t>zyskał akcję „Kontakty” przy każdej firmie: rozwija listę zapisanych dla niej osób z możliwością edycji i usunięcia każdej z osobna oraz formularzem dodania kolejnej, bez przechodzenia do osobnej zakładki. Dodano migrację uzupełniającą kontakty zapisane, zanim ta poprawka weszła w życie. Dodano tryb „Wysoki kontrast” (przycisk obok Jasny/Ciemny, dostępny na wszystkich podstronach). W tym samym okresie dodano historię zmian cen bazowych PGL z eksportem do Excela, kolorowe oznaczenia typów stali HRS/CR/HDG w panelu ustawień oraz klikalne kafelki statusów na pulpicie administratora, a w kalkulatorze kliknięcie wiersza pozycji otwiera ją do edycji. Kolumna „Uwagi” w PDF oferty pokazuje teraz pełny zestaw wybranych dopłat dla każdej pozycji. Panel ustawień administratora zyskał próg „Minimalna marża (%)” - junior może odtąd wysłać ofertę do klienta bezpośrednio z szkicu, bez zatwierdzenia seniora/administratora, jeśli każda pozycja ma marżę i PGL bazowe w normie; w przeciwnym razie oferta nadal wymaga pełnej ścieżki zatwierdzenia. Kliknięcie w ofertę na liście (Moje oferty, Panel seniora, Panel administratora) otwiera ją teraz do edycji, tak jak pozycje w kalkulatorze. Edycja już zapisanej oferty nie nadpisuje jej w miejscu - zapisuje nową wersję („offer_30.1”, „offer_30.</w:t>
-            </w:r>
-            <w:proofErr w:type="gramStart"/>
-            <w:r>
-              <w:t>2”...</w:t>
-            </w:r>
-            <w:proofErr w:type="gramEnd"/>
-            <w:r>
-              <w:t xml:space="preserve">), a poprzednie wersje zostają widoczne pod rozwijaną listą na tej samej karcie. W tym samym okresie dodano trzy nowe typy stali obok HRS/CR/HDG: PICKLED (HRS Trawiona), TEARDROP (Blacha łezkowa) i ZM (Magnelis) - wraz z własnymi tabelami gatunków, matrycami dopłat wymiarowych i </w:t>
-            </w:r>
-            <w:r>
+              <w:t xml:space="preserve">zyskał akcję „Kontakty” przy każdej firmie: rozwija listę zapisanych dla niej osób z możliwością edycji i usunięcia każdej z osobna oraz formularzem dodania kolejnej, bez przechodzenia do osobnej zakładki. Dodano migrację uzupełniającą kontakty zapisane, zanim ta poprawka weszła w życie. Dodano tryb „Wysoki kontrast” (przycisk obok Jasny/Ciemny, dostępny na wszystkich podstronach). W tym samym okresie dodano historię zmian cen bazowych PGL z eksportem do Excela, kolorowe oznaczenia typów stali HRS/CR/HDG w panelu ustawień oraz klikalne kafelki statusów na pulpicie administratora, a w kalkulatorze kliknięcie wiersza pozycji otwiera ją do edycji. Kolumna „Uwagi” w PDF oferty pokazuje teraz pełny zestaw wybranych dopłat dla każdej pozycji. Panel ustawień administratora zyskał próg „Minimalna marża (%)” - junior może odtąd wysłać ofertę do klienta bezpośrednio z szkicu, bez zatwierdzenia seniora/administratora, jeśli każda pozycja ma marżę i PGL bazowe w normie; w przeciwnym razie oferta nadal wymaga pełnej ścieżki zatwierdzenia. Kliknięcie w ofertę na liście (Moje oferty, Panel seniora, Panel administratora) otwiera ją teraz do edycji, tak jak pozycje w kalkulatorze. Edycja już zapisanej oferty nie nadpisuje jej w miejscu - zapisuje nową wersję („offer_30.1”, „offer_30.2”...), a poprzednie wersje zostają widoczne pod rozwijaną listą na tej samej karcie. W tym samym okresie dodano trzy nowe typy stali obok HRS/CR/HDG: PICKLED (HRS Trawiona), TEARDROP (Blacha łezkowa) i ZM (Magnelis) - wraz z własnymi tabelami gatunków, matrycami dopłat wymiarowych i </w:t>
               <w:lastRenderedPageBreak/>
               <w:t>(dla ZM) matrycą powłoki, w oparciu o dane przekazane przez klienta.</w:t>
             </w:r>
@@ -537,8 +510,6 @@
           <w:p>
             <w:r>
               <w:t xml:space="preserve">Panel administratora zyskał obsługę zatwierdzania, odrzucania i edycji ofert; wysyłka do klienta rozszerzona na starszego handlowca i administratora wraz z zakładkami szybkiego filtrowania; dodane języki czeski i niemiecki oraz sortowanie listy ofert. Dodano panel ustawień administratora (kurs EUR/PLN, PGL </w:t>
-            </w:r>
-            <w:r>
               <w:lastRenderedPageBreak/>
               <w:t>bazowe, transport bazowy) oraz przełącznik waluty EURO/PLN w kalkulatorze; oferta zapamiętuje walutę handlowca i kurs z dnia wyceny. Dodano trwałe, unikalne numery ofert wraz z automatyczną nazwą zastępczą „offer_&lt;numer&gt;” dla ofert bez tytułu oraz wyszukiwarkę ofert (po nazwie, nazwie zastępczej i numerze); uprawnienia administratora zrównane ze starszym handlowcem na własnych ofertach.</w:t>
             </w:r>
@@ -690,15 +661,7 @@
           </w:tcPr>
           <w:p>
             <w:r>
-              <w:t xml:space="preserve">Wersja </w:t>
-            </w:r>
-            <w:proofErr w:type="gramStart"/>
-            <w:r>
-              <w:t>bazowa  -</w:t>
-            </w:r>
-            <w:proofErr w:type="gramEnd"/>
-            <w:r>
-              <w:t xml:space="preserve"> stan wyjściowy aplikacji.</w:t>
+              <w:t xml:space="preserve">Wersja bazowa  - stan wyjściowy aplikacji.</w:t>
             </w:r>
           </w:p>
         </w:tc>
@@ -1031,6 +994,28 @@
           <w:p>
             <w:r>
               <w:t>Zapis ustawień nie nadpisuje już ręcznej ceny bazowej PGL ceną kwartalną. Gdy dla danego typu stali obowiązywała cena zaplanowana na bieżący kwartał, formularz ustawień trzymał właśnie tę wartość i przy zapisie karty odsyłał ją do kolumny z ceną ręczną — czyli do wartości, z której kalkulator korzysta po zakończeniu kwartału, gdy kolejny nie ma jeszcze zaplanowanej ceny. Działo się to przy każdym zapisie tej karty, również wtedy, gdy administrator zmieniał wyłącznie kurs waluty. Po poprawce zapis pomija ceny bazowe tych typów, dla których bieżący kwartał ma zaplanowaną cenę — ich pola i tak są w tabeli tylko do odczytu. Błąd wykryty i naprawiony przed wdrożeniem wersji 1.8.</w:t>
+            </w:r>
+          </w:p>
+        </w:tc>
+      </w:tr>
+      <w:tr>
+        <w:tc>
+          <w:tcPr>
+            <w:tcW w:w="1948" w:type="dxa"/>
+          </w:tcPr>
+          <w:p>
+            <w:r>
+              <w:t>Poprawka</w:t>
+            </w:r>
+          </w:p>
+        </w:tc>
+        <w:tc>
+          <w:tcPr>
+            <w:tcW w:w="6908" w:type="dxa"/>
+          </w:tcPr>
+          <w:p>
+            <w:r>
+              <w:t>Widoczność ostrzeżeń o cenie poniżej progu — komunikaty „PGL poniżej bazy” i „marża poniżej minimum” były drobnym żółtym tekstem z ikoną ⚠, słabo zauważalnym na liście parametrów; handlowcy zgłaszali, że łatwo je przeoczyć, mimo że pozycja z taką wartością wymaga później zatwierdzenia oferty (patrz lib/offerReview.ts). Oba komunikaty przeniesiono do wyraźnie odznaczonego, czerwono obramowanego bloku z pogrubionym tekstem, zamiast dotychczasowej cienkiej żółtej linijki.</w:t>
             </w:r>
           </w:p>
         </w:tc>

</xml_diff>

<commit_message>
feat: scrap surcharge is now % of input price, admin-configurable
Replaces the flat SCRAP_CONSTANT (10 EUR/t) in the SSC summary with a
percentage of the input price (PGL + Sum Mill), defaulting to 2% and
editable by the admin in Ustawienia (new "Zlom (%)" field), same
pattern as the existing minimum-margin setting. Requires migration
022_add_scrap_pct.sql. Also updates the two standalone legacy HTML
calculators with the same formula, and documents the change in the
v1.8 version report.

Co-Authored-By: Claude Sonnet 5 <noreply@anthropic.com>
Claude-Session: https://claude.ai/code/session_01AJYURkiVB196M4vPcp5gKU
</commit_message>
<xml_diff>
--- a/Historia wersji oraz md/Historia wersji/AMSteel_Quote_Raport_Wersji_1.8.docx
+++ b/Historia wersji oraz md/Historia wersji/AMSteel_Quote_Raport_Wersji_1.8.docx
@@ -282,7 +282,7 @@
           </w:tcPr>
           <w:p>
             <w:r>
-              <w:t>Dodano opcjonalny komentarz do pozycji z niezerową dopłatą dodatkową w kalkulatorze. Pole komentarza oraz osobny checkbox „Dołącz komentarz do PDF” pojawiają się dopiero po wpisaniu wartości różnej od zera, a treść zapisuje się razem z resztą konfiguracji pozycji (odtwarzana przy edycji, nieusuwana przy chwilowym wyzerowaniu dopłaty). Po zaznaczeniu checkboxa komentarz trafia jako dodatkowy wpis do kolumny „Uwagi” w PDF oferty, we wszystkich miejscach eksportu (kalkulator, Moje oferty, Panel seniora, Panel administratora). Dodano również gatunek jednorazowy — możliwość wyceny gatunku spoza cennika (nazwa + dopłata EUR/t) w obrębie jednej oferty, bez dopisywania go do cennika i bez wpływu na pozostałe oferty. Dodano też opcję odbioru własnego w transporcie — checkbox w panelu „Trasa i transport” ustawia transport na 0 €/t, gdy klient sam odbiera towar spod zakładu. Dodano też harmonogram kwartalny PGL bazowego: administrator planuje ceny na Q1–Q4 wybranego roku osobno dla każdego typu stali, a kalkulator przełącza się na cenę danego kwartału automatycznie z chwilą jego rozpoczęcia. Tabela w panelu administratora pokazuje obok siebie cenę bieżącego miesiąca i wszystkie cztery kwartały. Funkcja wymaga migracji bazy danych (021_create_pgl_quarterly_prices.sql). Poprawiono też zapis ustawień, który przy aktywnej cenie kwartalnej nadpisywał nią ręczną cenę bazową PGL, oraz zaktualizowano dokumentację repozytorium (README, opis „About” na GitHubie, zrzuty ekranu kalkulatora) i numer wersji w nagłówku aplikacji do v1.8. Cały panel kalkulacji zyskał też zwijanie/rozwijanie jednym kliknięciem, analogicznie do panelu Danych Klienta. Ostrzeżenia o PGL poniżej bazy i marży poniżej minimum stały się też wyraźnie widoczne - zamiast drobnego żółtego tekstu pokazują się teraz jako czerwono obramowany, pogrubiony komunikat.</w:t>
+              <w:t>Dodano opcjonalny komentarz do pozycji z niezerową dopłatą dodatkową w kalkulatorze. Pole komentarza oraz osobny checkbox „Dołącz komentarz do PDF” pojawiają się dopiero po wpisaniu wartości różnej od zera, a treść zapisuje się razem z resztą konfiguracji pozycji (odtwarzana przy edycji, nieusuwana przy chwilowym wyzerowaniu dopłaty). Po zaznaczeniu checkboxa komentarz trafia jako dodatkowy wpis do kolumny „Uwagi” w PDF oferty, we wszystkich miejscach eksportu (kalkulator, Moje oferty, Panel seniora, Panel administratora). Dodano również gatunek jednorazowy — możliwość wyceny gatunku spoza cennika (nazwa + dopłata EUR/t) w obrębie jednej oferty, bez dopisywania go do cennika i bez wpływu na pozostałe oferty. Dodano też opcję odbioru własnego w transporcie — checkbox w panelu „Trasa i transport” ustawia transport na 0 €/t, gdy klient sam odbiera towar spod zakładu. Dodano też harmonogram kwartalny PGL bazowego: administrator planuje ceny na Q1–Q4 wybranego roku osobno dla każdego typu stali, a kalkulator przełącza się na cenę danego kwartału automatycznie z chwilą jego rozpoczęcia. Tabela w panelu administratora pokazuje obok siebie cenę bieżącego miesiąca i wszystkie cztery kwartały. Funkcja wymaga migracji bazy danych (021_create_pgl_quarterly_prices.sql). Poprawiono też zapis ustawień, który przy aktywnej cenie kwartalnej nadpisywał nią ręczną cenę bazową PGL, oraz zaktualizowano dokumentację repozytorium (README, opis „About” na GitHubie, zrzuty ekranu kalkulatora) i numer wersji w nagłówku aplikacji do v1.8. Cały panel kalkulacji zyskał też zwijanie/rozwijanie jednym kliknięciem, analogicznie do panelu Danych Klienta. Ostrzeżenia o PGL poniżej bazy i marży poniżej minimum stały się też wyraźnie widoczne - zamiast drobnego żółtego tekstu pokazują się teraz jako czerwono obramowany, pogrubiony komunikat. Złom w podsumowaniu SSC przestał być stałą kwotą 10 €/t — jest teraz % ceny wsadu (domyślnie 2%), konfigurowalny przez administratora w Ustawieniach.</w:t>
             </w:r>
           </w:p>
         </w:tc>
@@ -1020,6 +1020,28 @@
           </w:p>
         </w:tc>
       </w:tr>
+      <w:tr>
+        <w:tc>
+          <w:tcPr>
+            <w:tcW w:w="1948" w:type="dxa"/>
+          </w:tcPr>
+          <w:p>
+            <w:r>
+              <w:t>Zmiana</w:t>
+            </w:r>
+          </w:p>
+        </w:tc>
+        <w:tc>
+          <w:tcPr>
+            <w:tcW w:w="6908" w:type="dxa"/>
+          </w:tcPr>
+          <w:p>
+            <w:r>
+              <w:t>Złom w podsumowaniu SSC — dotąd stała kwota 10 €/t (SCRAP_CONSTANT w kodzie), teraz % ceny wsadu (PGL + Σ Huta), domyślnie 2%. Procent jest konfigurowalny przez administratora w Ustawieniach (nowe pole „Złom (%)”, walidacja 0–100, ten sam mechanizm co minimalna marża) i zapisany w bazie (migracja 022_add_scrap_pct.sql). Wiersz „Złom” w podsumowaniu pokazuje teraz aktualny procent i przeliczoną kwotę zamiast dotychczasowego oznaczenia „(stała)”. Tą samą logiką zaktualizowano też dwa niezależne, samodzielne kalkulatory HTML w repozytorium (index.html, steel_calculator_standalone.html).</w:t>
+            </w:r>
+          </w:p>
+        </w:tc>
+      </w:tr>
     </w:tbl>
     <w:p>
       <w:pPr>

</xml_diff>

<commit_message>
fix: PGL price history now logs quarterly-schedule changes
When a steel type has an active price for the current quarter, the
base-price field in admin/ustawienia is read-only and the only way to
change the effective price is editing that quarter's cell, which saves
through PUT /api/settings/pgl-quarterly. That endpoint never wrote to
pgl_price_history, so those changes never showed up in the price
change log even though the price was actually updated.

PUT /api/settings/pgl-quarterly now compares old vs. new effective
price for the current quarter and logs to pgl_price_history the same
way the manual PATCH /api/settings save already does. The admin page
also refreshes the history table after a quarterly-grid save, not
just after the manual-fields save.

Also updates the v1.8 version report with this fix.

Co-Authored-By: Claude Sonnet 5 <noreply@anthropic.com>
Claude-Session: https://claude.ai/code/session_01RZ7UQycbbM3sePaM1AUpvd
</commit_message>
<xml_diff>
--- a/Historia wersji oraz md/Historia wersji/AMSteel_Quote_Raport_Wersji_1.8.docx
+++ b/Historia wersji oraz md/Historia wersji/AMSteel_Quote_Raport_Wersji_1.8.docx
@@ -282,7 +282,7 @@
           </w:tcPr>
           <w:p>
             <w:r>
-              <w:t>Dodano opcjonalny komentarz do pozycji z niezerową dopłatą dodatkową w kalkulatorze. Pole komentarza oraz osobny checkbox „Dołącz komentarz do PDF” pojawiają się dopiero po wpisaniu wartości różnej od zera, a treść zapisuje się razem z resztą konfiguracji pozycji (odtwarzana przy edycji, nieusuwana przy chwilowym wyzerowaniu dopłaty). Po zaznaczeniu checkboxa komentarz trafia jako dodatkowy wpis do kolumny „Uwagi” w PDF oferty, we wszystkich miejscach eksportu (kalkulator, Moje oferty, Panel seniora, Panel administratora). Dodano również gatunek jednorazowy — możliwość wyceny gatunku spoza cennika (nazwa + dopłata EUR/t) w obrębie jednej oferty, bez dopisywania go do cennika i bez wpływu na pozostałe oferty. Dodano też opcję odbioru własnego w transporcie — checkbox w panelu „Trasa i transport” ustawia transport na 0 €/t, gdy klient sam odbiera towar spod zakładu. Dodano też harmonogram kwartalny PGL bazowego: administrator planuje ceny na Q1–Q4 wybranego roku osobno dla każdego typu stali, a kalkulator przełącza się na cenę danego kwartału automatycznie z chwilą jego rozpoczęcia. Tabela w panelu administratora pokazuje obok siebie cenę bieżącego miesiąca i wszystkie cztery kwartały. Funkcja wymaga migracji bazy danych (021_create_pgl_quarterly_prices.sql). Poprawiono też zapis ustawień, który przy aktywnej cenie kwartalnej nadpisywał nią ręczną cenę bazową PGL, oraz zaktualizowano dokumentację repozytorium (README, opis „About” na GitHubie, zrzuty ekranu kalkulatora) i numer wersji w nagłówku aplikacji do v1.8. Cały panel kalkulacji zyskał też zwijanie/rozwijanie jednym kliknięciem, analogicznie do panelu Danych Klienta. Ostrzeżenia o PGL poniżej bazy i marży poniżej minimum stały się też wyraźnie widoczne - zamiast drobnego żółtego tekstu pokazują się teraz jako czerwono obramowany, pogrubiony komunikat. Złom w podsumowaniu SSC przestał być stałą kwotą 10 €/t — jest teraz % ceny wsadu (domyślnie 2%), konfigurowalny przez administratora w Ustawieniach.</w:t>
+              <w:t>Dodano opcjonalny komentarz do pozycji z niezerową dopłatą dodatkową w kalkulatorze. Pole komentarza oraz osobny checkbox „Dołącz komentarz do PDF” pojawiają się dopiero po wpisaniu wartości różnej od zera, a treść zapisuje się razem z resztą konfiguracji pozycji (odtwarzana przy edycji, nieusuwana przy chwilowym wyzerowaniu dopłaty). Po zaznaczeniu checkboxa komentarz trafia jako dodatkowy wpis do kolumny „Uwagi” w PDF oferty, we wszystkich miejscach eksportu (kalkulator, Moje oferty, Panel seniora, Panel administratora). Dodano również gatunek jednorazowy — możliwość wyceny gatunku spoza cennika (nazwa + dopłata EUR/t) w obrębie jednej oferty, bez dopisywania go do cennika i bez wpływu na pozostałe oferty. Dodano też opcję odbioru własnego w transporcie — checkbox w panelu „Trasa i transport” ustawia transport na 0 €/t, gdy klient sam odbiera towar spod zakładu. Dodano też harmonogram kwartalny PGL bazowego: administrator planuje ceny na Q1–Q4 wybranego roku osobno dla każdego typu stali, a kalkulator przełącza się na cenę danego kwartału automatycznie z chwilą jego rozpoczęcia. Tabela w panelu administratora pokazuje obok siebie cenę bieżącego miesiąca i wszystkie cztery kwartały. Funkcja wymaga migracji bazy danych (021_create_pgl_quarterly_prices.sql). Poprawiono też zapis ustawień, który przy aktywnej cenie kwartalnej nadpisywał nią ręczną cenę bazową PGL, oraz zaktualizowano dokumentację repozytorium (README, opis „About” na GitHubie, zrzuty ekranu kalkulatora) i numer wersji w nagłówku aplikacji do v1.8. Cały panel kalkulacji zyskał też zwijanie/rozwijanie jednym kliknięciem, analogicznie do panelu Danych Klienta. Ostrzeżenia o PGL poniżej bazy i marży poniżej minimum stały się też wyraźnie widoczne - zamiast drobnego żółtego tekstu pokazują się teraz jako czerwono obramowany, pogrubiony komunikat. Złom w podsumowaniu SSC przestał być stałą kwotą 10 €/t — jest teraz % ceny wsadu (domyślnie 2%), konfigurowalny przez administratora w Ustawieniach. Poprawiono też historię zmian cen bazowych PGL, która nie rejestrowała zmian wprowadzanych przez harmonogram kwartalny (edycję ceny bieżącego kwartału) — teraz trafiają do tego samego logu co ręczne zmiany.</w:t>
             </w:r>
           </w:p>
         </w:tc>
@@ -1042,6 +1042,28 @@
           </w:p>
         </w:tc>
       </w:tr>
+      <w:tr>
+        <w:tc>
+          <w:tcPr>
+            <w:tcW w:w="1948" w:type="dxa"/>
+          </w:tcPr>
+          <w:p>
+            <w:r>
+              <w:t>Poprawka</w:t>
+            </w:r>
+          </w:p>
+        </w:tc>
+        <w:tc>
+          <w:tcPr>
+            <w:tcW w:w="6908" w:type="dxa"/>
+          </w:tcPr>
+          <w:p>
+            <w:r>
+              <w:t>Historia zmian cen bazowych PGL nie rejestrowała zmian wprowadzanych przez harmonogram kwartalny. Gdy dla danego typu stali bieżący kwartał miał zaplanowaną cenę, pole ręczne w tabeli było tylko do odczytu, a jedynym sposobem na zmianę ceny „teraz” była edycja komórki tego kwartału — ten zapis szedł osobnym mechanizmem (PUT /api/settings/pgl-quarterly) i nie trafiał do logu historii, mimo że cena faktycznie się zmieniała. Po poprawce zmiana ceny bieżącego kwartału jest logowana tym samym mechanizmem co ręczna zmiana ceny bazowej, a panel odświeża tabelę historii również po zapisie harmonogramu.</w:t>
+            </w:r>
+          </w:p>
+        </w:tc>
+      </w:tr>
     </w:tbl>
     <w:p>
       <w:pPr>

</xml_diff>